<commit_message>
test video Youtube Link
mannequin chase test video
</commit_message>
<xml_diff>
--- a/Work/2022184042_HSW/WorkLog/홍승우_작업일지_5주차.docx
+++ b/Work/2022184042_HSW/WorkLog/홍승우_작업일지_5주차.docx
@@ -51,9 +51,6 @@
             <w:tcW w:w="1843" w:type="dxa"/>
           </w:tcPr>
           <w:p>
-            <w:pPr>
-              <w:spacing w:before="0" w:after="0" w:line="240" w:lineRule="auto"/>
-            </w:pPr>
             <w:r>
               <w:rPr>
                 <w:sz w:val="18"/>
@@ -88,16 +85,23 @@
             <w:tcW w:w="1275" w:type="dxa"/>
           </w:tcPr>
           <w:p>
-            <w:pPr>
-              <w:spacing w:before="0" w:after="0" w:line="240" w:lineRule="auto"/>
-            </w:pPr>
             <w:r>
               <w:rPr>
                 <w:sz w:val="16"/>
               </w:rPr>
               <w:t>2026.09.30</w:t>
+            </w:r>
+            <w:r>
+              <w:rPr>
+                <w:sz w:val="16"/>
+              </w:rPr>
               <w:br/>
               <w:t>~</w:t>
+            </w:r>
+            <w:r>
+              <w:rPr>
+                <w:sz w:val="16"/>
+              </w:rPr>
               <w:br/>
               <w:t>2026.10.06</w:t>
             </w:r>
@@ -164,20 +168,37 @@
             <w:gridSpan w:val="5"/>
           </w:tcPr>
           <w:p>
-            <w:pPr>
-              <w:spacing w:before="0" w:after="0" w:line="240" w:lineRule="auto"/>
-            </w:pPr>
             <w:r>
               <w:rPr>
                 <w:sz w:val="16"/>
               </w:rPr>
               <w:t>1. 백화점 맵 참고자료 수집 및 분류</w:t>
+            </w:r>
+            <w:r>
+              <w:rPr>
+                <w:sz w:val="16"/>
+              </w:rPr>
               <w:br/>
               <w:t>2. 파트너 모델링용 삼면도 제작</w:t>
+            </w:r>
+            <w:r>
+              <w:rPr>
+                <w:sz w:val="16"/>
+              </w:rPr>
               <w:br/>
               <w:t>3. 주요 시스템 우선순위 및 개발 현황 기록</w:t>
+            </w:r>
+            <w:r>
+              <w:rPr>
+                <w:sz w:val="16"/>
+              </w:rPr>
               <w:br/>
               <w:t>4. 조명 오류 확인 및 맵 제작 순서 결정</w:t>
+            </w:r>
+            <w:r>
+              <w:rPr>
+                <w:sz w:val="16"/>
+              </w:rPr>
               <w:br/>
               <w:t>5. 마네킹 추적 로직 시각화 문서 작성 중</w:t>
             </w:r>
@@ -187,7 +208,7 @@
     </w:tbl>
     <w:p>
       <w:pPr>
-        <w:spacing w:before="0" w:after="20" w:line="240" w:lineRule="auto"/>
+        <w:spacing w:after="20" w:line="240" w:lineRule="auto"/>
       </w:pPr>
       <w:r>
         <w:rPr>
@@ -205,82 +226,132 @@
     </w:p>
     <w:p>
       <w:pPr>
-        <w:spacing w:before="0" w:after="20" w:line="240" w:lineRule="auto"/>
+        <w:spacing w:after="20" w:line="240" w:lineRule="auto"/>
       </w:pPr>
       <w:r>
         <w:rPr>
           <w:sz w:val="16"/>
         </w:rPr>
         <w:t>1. 백화점 맵 참고자료 수집 및 분류</w:t>
+      </w:r>
+      <w:r>
+        <w:rPr>
+          <w:sz w:val="16"/>
+        </w:rPr>
         <w:br/>
         <w:t>롯데백화점·하남 스타필드·신세계·엔터식스 현장 사진을 맵 참고자료 폴더에 정리함.</w:t>
+      </w:r>
+      <w:r>
+        <w:rPr>
+          <w:sz w:val="16"/>
+        </w:rPr>
         <w:br/>
         <w:t>통로 폭, 매장 배치, 천장·조명과 휴게공간 구성을 비교해 맵 제작에 활용할 요소를 선별함.</w:t>
       </w:r>
     </w:p>
     <w:p>
       <w:pPr>
-        <w:spacing w:before="0" w:after="20" w:line="240" w:lineRule="auto"/>
+        <w:spacing w:after="20" w:line="240" w:lineRule="auto"/>
       </w:pPr>
       <w:r>
         <w:rPr>
           <w:sz w:val="16"/>
         </w:rPr>
         <w:t>2. 파트너 모델링용 삼면도 제작</w:t>
+      </w:r>
+      <w:r>
+        <w:rPr>
+          <w:sz w:val="16"/>
+        </w:rPr>
         <w:br/>
         <w:t>파트너의 신체 베이스와 의상·헤어·신발 요소를 정면·측면·후면 기준의 삼면도로 제작함.</w:t>
+      </w:r>
+      <w:r>
+        <w:rPr>
+          <w:sz w:val="16"/>
+        </w:rPr>
         <w:br/>
         <w:t>훼손 단계별 모자·머리·셔츠·양말·스타킹 변형을 구분해 모델링 참고자료로 구조화함.</w:t>
       </w:r>
     </w:p>
     <w:p>
       <w:pPr>
-        <w:spacing w:before="0" w:after="20" w:line="240" w:lineRule="auto"/>
+        <w:spacing w:after="20" w:line="240" w:lineRule="auto"/>
       </w:pPr>
       <w:r>
         <w:rPr>
           <w:sz w:val="16"/>
         </w:rPr>
         <w:t>3. 주요 시스템 우선순위 및 개발 현황 기록</w:t>
+      </w:r>
+      <w:r>
+        <w:rPr>
+          <w:sz w:val="16"/>
+        </w:rPr>
         <w:br/>
         <w:t>교수님 피드백에 따라 심박수·광원 효과보다 핵심 시스템의 완성도를 우선하도록 개발 순서를 정리함.</w:t>
+      </w:r>
+      <w:r>
+        <w:rPr>
+          <w:sz w:val="16"/>
+        </w:rPr>
         <w:br/>
         <w:t>마네킹 경계 동작, 심박수 변수 개편과 서버·리더보드 진행 상황을 회의 기록으로 문서화함.</w:t>
       </w:r>
     </w:p>
     <w:p>
       <w:pPr>
-        <w:spacing w:before="0" w:after="20" w:line="240" w:lineRule="auto"/>
+        <w:spacing w:after="20" w:line="240" w:lineRule="auto"/>
       </w:pPr>
       <w:r>
         <w:rPr>
           <w:sz w:val="16"/>
         </w:rPr>
         <w:t>4. 조명 오류 확인 및 맵 제작 순서 결정</w:t>
+      </w:r>
+      <w:r>
+        <w:rPr>
+          <w:sz w:val="16"/>
+        </w:rPr>
         <w:br/>
         <w:t>조명 블루프린트의 부모 클래스 로딩 오류를 확인하고 바이너리 갱신 절차로 정상 작동을 확인함.</w:t>
+      </w:r>
+      <w:r>
+        <w:rPr>
+          <w:sz w:val="16"/>
+        </w:rPr>
         <w:br/>
         <w:t>캐릭터 모델링과 병행하되 백화점 맵 제작을 먼저 진행할 수 있도록 다음 작업 순서를 정리함.</w:t>
       </w:r>
     </w:p>
     <w:p>
       <w:pPr>
-        <w:spacing w:before="0" w:after="20" w:line="240" w:lineRule="auto"/>
+        <w:spacing w:after="20" w:line="240" w:lineRule="auto"/>
       </w:pPr>
       <w:r>
         <w:rPr>
           <w:sz w:val="16"/>
         </w:rPr>
         <w:t>5. 마네킹 추적 로직 시각화 문서 작성 중</w:t>
+      </w:r>
+      <w:r>
+        <w:rPr>
+          <w:sz w:val="16"/>
+        </w:rPr>
         <w:br/>
         <w:t>마네킹의 추적 범위와 영역별 행동 전환을 팀원이 쉽게 확인할 수 있도록 시각화 문서를 작성 중임.</w:t>
+      </w:r>
+      <w:r>
+        <w:rPr>
+          <w:sz w:val="16"/>
+        </w:rPr>
         <w:br/>
         <w:t>현재 로직과 경계 예외 처리의 흐름을 도식으로 정리한 뒤 완성본을 저장소에 공유할 예정임.</w:t>
       </w:r>
     </w:p>
     <w:p>
       <w:pPr>
-        <w:spacing w:before="0" w:after="0" w:line="240" w:lineRule="auto"/>
+        <w:spacing w:after="0" w:line="240" w:lineRule="auto"/>
       </w:pPr>
       <w:r>
         <w:rPr>
@@ -295,6 +366,29 @@
         </w:rPr>
         <w:t xml:space="preserve">: </w:t>
       </w:r>
+      <w:hyperlink r:id="rId7" w:history="1">
+        <w:r>
+          <w:rPr>
+            <w:rStyle w:val="a5"/>
+            <w:sz w:val="16"/>
+          </w:rPr>
+          <w:t>https://youtu.be/--Z-7</w:t>
+        </w:r>
+        <w:r>
+          <w:rPr>
+            <w:rStyle w:val="a5"/>
+            <w:sz w:val="16"/>
+          </w:rPr>
+          <w:t>L</w:t>
+        </w:r>
+        <w:r>
+          <w:rPr>
+            <w:rStyle w:val="a5"/>
+            <w:sz w:val="16"/>
+          </w:rPr>
+          <w:t>BWvTc</w:t>
+        </w:r>
+      </w:hyperlink>
     </w:p>
     <w:tbl>
       <w:tblPr>
@@ -336,9 +430,6 @@
             <w:gridSpan w:val="3"/>
           </w:tcPr>
           <w:p>
-            <w:pPr>
-              <w:spacing w:before="0" w:after="0" w:line="240" w:lineRule="auto"/>
-            </w:pPr>
             <w:r>
               <w:rPr>
                 <w:sz w:val="16"/>
@@ -376,9 +467,6 @@
             <w:gridSpan w:val="3"/>
           </w:tcPr>
           <w:p>
-            <w:pPr>
-              <w:spacing w:before="0" w:after="0" w:line="240" w:lineRule="auto"/>
-            </w:pPr>
             <w:r>
               <w:rPr>
                 <w:sz w:val="16"/>
@@ -415,9 +503,6 @@
             <w:tcW w:w="2254" w:type="dxa"/>
           </w:tcPr>
           <w:p>
-            <w:pPr>
-              <w:spacing w:before="0" w:after="0" w:line="240" w:lineRule="auto"/>
-            </w:pPr>
             <w:r>
               <w:rPr>
                 <w:sz w:val="18"/>
@@ -452,16 +537,23 @@
             <w:tcW w:w="2254" w:type="dxa"/>
           </w:tcPr>
           <w:p>
-            <w:pPr>
-              <w:spacing w:before="0" w:after="0" w:line="240" w:lineRule="auto"/>
-            </w:pPr>
             <w:r>
               <w:rPr>
                 <w:sz w:val="16"/>
               </w:rPr>
               <w:t>2026.10.07</w:t>
+            </w:r>
+            <w:r>
+              <w:rPr>
+                <w:sz w:val="16"/>
+              </w:rPr>
               <w:br/>
               <w:t>~</w:t>
+            </w:r>
+            <w:r>
+              <w:rPr>
+                <w:sz w:val="16"/>
+              </w:rPr>
               <w:br/>
               <w:t>2026.10.13</w:t>
             </w:r>
@@ -499,16 +591,23 @@
             <w:gridSpan w:val="3"/>
           </w:tcPr>
           <w:p>
-            <w:pPr>
-              <w:spacing w:before="0" w:after="0" w:line="240" w:lineRule="auto"/>
-            </w:pPr>
             <w:r>
               <w:rPr>
                 <w:sz w:val="16"/>
               </w:rPr>
               <w:t>1. 마네킹 추적 로직 시각화 문서 완성 및 저장소 공유</w:t>
+            </w:r>
+            <w:r>
+              <w:rPr>
+                <w:sz w:val="16"/>
+              </w:rPr>
               <w:br/>
               <w:t>2. 파트너 삼면도를 기준으로 모델링 세부 규격 확정 및 제작 착수</w:t>
+            </w:r>
+            <w:r>
+              <w:rPr>
+                <w:sz w:val="16"/>
+              </w:rPr>
               <w:br/>
               <w:t>3. 백화점 러프 맵 제작과 핵심 시스템 통합 테스트 진행</w:t>
             </w:r>
@@ -574,16 +673,11 @@
     </w:tbl>
     <w:p>
       <w:pPr>
-        <w:spacing w:before="0" w:after="0" w:line="20" w:lineRule="exact"/>
-      </w:pPr>
-      <w:r>
-        <w:rPr>
-          <w:sz w:val="2"/>
-        </w:rPr>
-      </w:r>
+        <w:spacing w:after="0" w:line="20" w:lineRule="exact"/>
+      </w:pPr>
     </w:p>
     <w:sectPr>
-      <w:headerReference w:type="default" r:id="rId7"/>
+      <w:headerReference w:type="default" r:id="rId8"/>
       <w:pgSz w:w="11906" w:h="16838"/>
       <w:pgMar w:top="1701" w:right="1440" w:bottom="1440" w:left="1440" w:header="851" w:footer="992" w:gutter="0"/>
       <w:cols w:space="720"/>
@@ -1778,6 +1872,18 @@
       <w:szCs w:val="24"/>
     </w:rPr>
   </w:style>
+  <w:style w:type="character" w:styleId="a9">
+    <w:name w:val="Unresolved Mention"/>
+    <w:basedOn w:val="a0"/>
+    <w:uiPriority w:val="99"/>
+    <w:semiHidden/>
+    <w:unhideWhenUsed/>
+    <w:rsid w:val="00867BFA"/>
+    <w:rPr>
+      <w:color w:val="605E5C"/>
+      <w:shd w:val="clear" w:color="auto" w:fill="E1DFDD"/>
+    </w:rPr>
+  </w:style>
 </w:styles>
 </file>
 

</xml_diff>